<commit_message>
Raderade filer pga quota problem samt börjat skriva koden
</commit_message>
<xml_diff>
--- a/Dokumenten till RAG/Electrolux_tvättmaskinsmodeller.docx
+++ b/Dokumenten till RAG/Electrolux_tvättmaskinsmodeller.docx
@@ -60,48 +60,6 @@
       </w:pPr>
       <w:r>
         <w:t>EW6T272P5P</w:t>
-      </w:r>
-    </w:p>
-    <w:p>
-      <w:pPr>
-        <w:pStyle w:val="Liststycke"/>
-        <w:numPr>
-          <w:ilvl w:val="0"/>
-          <w:numId w:val="1"/>
-        </w:numPr>
-        <w:spacing w:before="100" w:beforeAutospacing="1" w:after="100" w:afterAutospacing="1" w:line="240" w:lineRule="auto"/>
-        <w:outlineLvl w:val="2"/>
-      </w:pPr>
-      <w:r>
-        <w:t>YFI8D53Y4Q</w:t>
-      </w:r>
-    </w:p>
-    <w:p>
-      <w:pPr>
-        <w:pStyle w:val="Liststycke"/>
-        <w:numPr>
-          <w:ilvl w:val="0"/>
-          <w:numId w:val="1"/>
-        </w:numPr>
-        <w:spacing w:before="100" w:beforeAutospacing="1" w:after="100" w:afterAutospacing="1" w:line="240" w:lineRule="auto"/>
-        <w:outlineLvl w:val="2"/>
-      </w:pPr>
-      <w:r>
-        <w:t>EFI743RX4R</w:t>
-      </w:r>
-    </w:p>
-    <w:p>
-      <w:pPr>
-        <w:pStyle w:val="Liststycke"/>
-        <w:numPr>
-          <w:ilvl w:val="0"/>
-          <w:numId w:val="1"/>
-        </w:numPr>
-        <w:spacing w:before="100" w:beforeAutospacing="1" w:after="100" w:afterAutospacing="1" w:line="240" w:lineRule="auto"/>
-        <w:outlineLvl w:val="2"/>
-      </w:pPr>
-      <w:r>
-        <w:t>EW6S540W34</w:t>
       </w:r>
     </w:p>
     <w:sectPr>
@@ -837,6 +795,7 @@
   <w:style w:type="character" w:default="1" w:styleId="Standardstycketeckensnitt">
     <w:name w:val="Default Paragraph Font"/>
     <w:uiPriority w:val="1"/>
+    <w:semiHidden/>
     <w:unhideWhenUsed/>
   </w:style>
   <w:style w:type="table" w:default="1" w:styleId="Normaltabell">

</xml_diff>